<commit_message>
Update submission Word document and final PDF
</commit_message>
<xml_diff>
--- a/KumarKshitij_230953488_FGAI_Assignment2.docx
+++ b/KumarKshitij_230953488_FGAI_Assignment2.docx
@@ -53,11 +53,13 @@
       <w:pPr>
         <w:pStyle w:val="Heading1"/>
         <w:ind w:left="244" w:hanging="259"/>
-      </w:pPr>
-      <w:r>
-        <w:t xml:space="preserve">Submission Details (Required by Step 3) </w:t>
-      </w:r>
-    </w:p>
+        <w:jc w:val="both"/>
+      </w:pPr>
+      <w:r>
+        <w:t>Submission Details</w:t>
+      </w:r>
+    </w:p>
+    <w:p/>
     <w:tbl>
       <w:tblPr>
         <w:tblStyle w:val="TableGrid"/>
@@ -68,7 +70,6 @@
         <w:tblCellMar>
           <w:top w:w="43" w:type="dxa"/>
           <w:left w:w="108" w:type="dxa"/>
-          <w:bottom w:w="0" w:type="dxa"/>
           <w:right w:w="115" w:type="dxa"/>
         </w:tblCellMar>
         <w:tblLook w:val="04A0" w:firstRow="1" w:lastRow="0" w:firstColumn="1" w:lastColumn="0" w:noHBand="0" w:noVBand="1"/>
@@ -381,7 +382,7 @@
       <w:pPr>
         <w:numPr>
           <w:ilvl w:val="0"/>
-          <w:numId w:val="1"/>
+          <w:numId w:val="3"/>
         </w:numPr>
       </w:pPr>
       <w:r>
@@ -391,13 +392,11 @@
         <w:t xml:space="preserve">Quantitative Superiority: </w:t>
       </w:r>
       <w:r>
-        <w:t xml:space="preserve">LSTM and GRU decisively outperform Simple RNN and Bidirectional RNN in validation loss and perplexity. LSTM achieved the lowest validation loss (4.8432) and lowest perplexity (126.88), with top-1 next-word accuracy of 18.79% and top-5 accuracy of </w:t>
-      </w:r>
-    </w:p>
-    <w:p>
-      <w:pPr>
-        <w:ind w:left="-5"/>
-      </w:pPr>
+        <w:t>LSTM and GRU decisively outperform Simple RNN and Bidirectional RNN in validation loss and perplexity. LSTM achieved the lowest validation loss (4.8432) and lowest perplexity (126.88), with top-1 next-word accuracy of 18.79% and top-5 accuracy of</w:t>
+      </w:r>
+      <w:r>
+        <w:t xml:space="preserve"> </w:t>
+      </w:r>
       <w:r>
         <w:t xml:space="preserve">41.44%. </w:t>
       </w:r>
@@ -406,7 +405,7 @@
       <w:pPr>
         <w:numPr>
           <w:ilvl w:val="0"/>
-          <w:numId w:val="1"/>
+          <w:numId w:val="3"/>
         </w:numPr>
       </w:pPr>
       <w:r>
@@ -431,7 +430,7 @@
       <w:pPr>
         <w:numPr>
           <w:ilvl w:val="0"/>
-          <w:numId w:val="1"/>
+          <w:numId w:val="3"/>
         </w:numPr>
       </w:pPr>
       <w:r>
@@ -449,7 +448,7 @@
       <w:pPr>
         <w:numPr>
           <w:ilvl w:val="0"/>
-          <w:numId w:val="1"/>
+          <w:numId w:val="3"/>
         </w:numPr>
         <w:spacing w:after="272"/>
       </w:pPr>
@@ -471,7 +470,6 @@
         <w:tblCellMar>
           <w:top w:w="39" w:type="dxa"/>
           <w:left w:w="108" w:type="dxa"/>
-          <w:bottom w:w="0" w:type="dxa"/>
           <w:right w:w="115" w:type="dxa"/>
         </w:tblCellMar>
         <w:tblLook w:val="04A0" w:firstRow="1" w:lastRow="0" w:firstColumn="1" w:lastColumn="0" w:noHBand="0" w:noVBand="1"/>
@@ -536,6 +534,119 @@
 <file path=word/numbering.xml><?xml version="1.0" encoding="utf-8"?>
 <w:numbering xmlns:wpc="http://schemas.microsoft.com/office/word/2010/wordprocessingCanvas" xmlns:cx="http://schemas.microsoft.com/office/drawing/2014/chartex" xmlns:cx1="http://schemas.microsoft.com/office/drawing/2015/9/8/chartex" xmlns:cx2="http://schemas.microsoft.com/office/drawing/2015/10/21/chartex" xmlns:cx3="http://schemas.microsoft.com/office/drawing/2016/5/9/chartex" xmlns:cx4="http://schemas.microsoft.com/office/drawing/2016/5/10/chartex" xmlns:cx5="http://schemas.microsoft.com/office/drawing/2016/5/11/chartex" xmlns:cx6="http://schemas.microsoft.com/office/drawing/2016/5/12/chartex" xmlns:cx7="http://schemas.microsoft.com/office/drawing/2016/5/13/chartex" xmlns:cx8="http://schemas.microsoft.com/office/drawing/2016/5/14/chartex" xmlns:mc="http://schemas.openxmlformats.org/markup-compatibility/2006" xmlns:aink="http://schemas.microsoft.com/office/drawing/2016/ink" xmlns:am3d="http://schemas.microsoft.com/office/drawing/2017/model3d" xmlns:o="urn:schemas-microsoft-com:office:office" xmlns:oel="http://schemas.microsoft.com/office/2019/extlst" xmlns:r="http://schemas.openxmlformats.org/officeDocument/2006/relationships" xmlns:m="http://schemas.openxmlformats.org/officeDocument/2006/math" xmlns:v="urn:schemas-microsoft-com:vml" xmlns:wp14="http://schemas.microsoft.com/office/word/2010/wordprocessingDrawing" xmlns:wp="http://schemas.openxmlformats.org/drawingml/2006/wordprocessingDrawing" xmlns:w10="urn:schemas-microsoft-com:office:word" xmlns:w="http://schemas.openxmlformats.org/wordprocessingml/2006/main" xmlns:w14="http://schemas.microsoft.com/office/word/2010/wordml" xmlns:w15="http://schemas.microsoft.com/office/word/2012/wordml" xmlns:w16cex="http://schemas.microsoft.com/office/word/2018/wordml/cex" xmlns:w16cid="http://schemas.microsoft.com/office/word/2016/wordml/cid" xmlns:w16="http://schemas.microsoft.com/office/word/2018/wordml" xmlns:w16du="http://schemas.microsoft.com/office/word/2023/wordml/word16du" xmlns:w16sdtdh="http://schemas.microsoft.com/office/word/2020/wordml/sdtdatahash" xmlns:w16sdtfl="http://schemas.microsoft.com/office/word/2024/wordml/sdtformatlock" xmlns:w16se="http://schemas.microsoft.com/office/word/2015/wordml/symex" xmlns:wpg="http://schemas.microsoft.com/office/word/2010/wordprocessingGroup" xmlns:wpi="http://schemas.microsoft.com/office/word/2010/wordprocessingInk" xmlns:wne="http://schemas.microsoft.com/office/word/2006/wordml" xmlns:wps="http://schemas.microsoft.com/office/word/2010/wordprocessingShape" mc:Ignorable="w14 w15 w16se w16cid w16 w16cex w16sdtdh w16sdtfl w16du wp14">
   <w:abstractNum w:abstractNumId="0" w15:restartNumberingAfterBreak="0">
+    <w:nsid w:val="2D915F82"/>
+    <w:multiLevelType w:val="hybridMultilevel"/>
+    <w:tmpl w:val="7E7CEB4C"/>
+    <w:lvl w:ilvl="0" w:tplc="40090001">
+      <w:start w:val="1"/>
+      <w:numFmt w:val="bullet"/>
+      <w:lvlText w:val=""/>
+      <w:lvlJc w:val="left"/>
+      <w:pPr>
+        <w:ind w:left="720" w:hanging="360"/>
+      </w:pPr>
+      <w:rPr>
+        <w:rFonts w:ascii="Symbol" w:hAnsi="Symbol" w:hint="default"/>
+      </w:rPr>
+    </w:lvl>
+    <w:lvl w:ilvl="1" w:tplc="40090003" w:tentative="1">
+      <w:start w:val="1"/>
+      <w:numFmt w:val="bullet"/>
+      <w:lvlText w:val="o"/>
+      <w:lvlJc w:val="left"/>
+      <w:pPr>
+        <w:ind w:left="1440" w:hanging="360"/>
+      </w:pPr>
+      <w:rPr>
+        <w:rFonts w:ascii="Courier New" w:hAnsi="Courier New" w:cs="Courier New" w:hint="default"/>
+      </w:rPr>
+    </w:lvl>
+    <w:lvl w:ilvl="2" w:tplc="40090005" w:tentative="1">
+      <w:start w:val="1"/>
+      <w:numFmt w:val="bullet"/>
+      <w:lvlText w:val=""/>
+      <w:lvlJc w:val="left"/>
+      <w:pPr>
+        <w:ind w:left="2160" w:hanging="360"/>
+      </w:pPr>
+      <w:rPr>
+        <w:rFonts w:ascii="Wingdings" w:hAnsi="Wingdings" w:hint="default"/>
+      </w:rPr>
+    </w:lvl>
+    <w:lvl w:ilvl="3" w:tplc="40090001" w:tentative="1">
+      <w:start w:val="1"/>
+      <w:numFmt w:val="bullet"/>
+      <w:lvlText w:val=""/>
+      <w:lvlJc w:val="left"/>
+      <w:pPr>
+        <w:ind w:left="2880" w:hanging="360"/>
+      </w:pPr>
+      <w:rPr>
+        <w:rFonts w:ascii="Symbol" w:hAnsi="Symbol" w:hint="default"/>
+      </w:rPr>
+    </w:lvl>
+    <w:lvl w:ilvl="4" w:tplc="40090003" w:tentative="1">
+      <w:start w:val="1"/>
+      <w:numFmt w:val="bullet"/>
+      <w:lvlText w:val="o"/>
+      <w:lvlJc w:val="left"/>
+      <w:pPr>
+        <w:ind w:left="3600" w:hanging="360"/>
+      </w:pPr>
+      <w:rPr>
+        <w:rFonts w:ascii="Courier New" w:hAnsi="Courier New" w:cs="Courier New" w:hint="default"/>
+      </w:rPr>
+    </w:lvl>
+    <w:lvl w:ilvl="5" w:tplc="40090005" w:tentative="1">
+      <w:start w:val="1"/>
+      <w:numFmt w:val="bullet"/>
+      <w:lvlText w:val=""/>
+      <w:lvlJc w:val="left"/>
+      <w:pPr>
+        <w:ind w:left="4320" w:hanging="360"/>
+      </w:pPr>
+      <w:rPr>
+        <w:rFonts w:ascii="Wingdings" w:hAnsi="Wingdings" w:hint="default"/>
+      </w:rPr>
+    </w:lvl>
+    <w:lvl w:ilvl="6" w:tplc="40090001" w:tentative="1">
+      <w:start w:val="1"/>
+      <w:numFmt w:val="bullet"/>
+      <w:lvlText w:val=""/>
+      <w:lvlJc w:val="left"/>
+      <w:pPr>
+        <w:ind w:left="5040" w:hanging="360"/>
+      </w:pPr>
+      <w:rPr>
+        <w:rFonts w:ascii="Symbol" w:hAnsi="Symbol" w:hint="default"/>
+      </w:rPr>
+    </w:lvl>
+    <w:lvl w:ilvl="7" w:tplc="40090003" w:tentative="1">
+      <w:start w:val="1"/>
+      <w:numFmt w:val="bullet"/>
+      <w:lvlText w:val="o"/>
+      <w:lvlJc w:val="left"/>
+      <w:pPr>
+        <w:ind w:left="5760" w:hanging="360"/>
+      </w:pPr>
+      <w:rPr>
+        <w:rFonts w:ascii="Courier New" w:hAnsi="Courier New" w:cs="Courier New" w:hint="default"/>
+      </w:rPr>
+    </w:lvl>
+    <w:lvl w:ilvl="8" w:tplc="40090005" w:tentative="1">
+      <w:start w:val="1"/>
+      <w:numFmt w:val="bullet"/>
+      <w:lvlText w:val=""/>
+      <w:lvlJc w:val="left"/>
+      <w:pPr>
+        <w:ind w:left="6480" w:hanging="360"/>
+      </w:pPr>
+      <w:rPr>
+        <w:rFonts w:ascii="Wingdings" w:hAnsi="Wingdings" w:hint="default"/>
+      </w:rPr>
+    </w:lvl>
+  </w:abstractNum>
+  <w:abstractNum w:abstractNumId="1" w15:restartNumberingAfterBreak="0">
     <w:nsid w:val="2FF75080"/>
     <w:multiLevelType w:val="hybridMultilevel"/>
     <w:tmpl w:val="BF9EBC02"/>
@@ -756,7 +867,7 @@
       </w:rPr>
     </w:lvl>
   </w:abstractNum>
-  <w:abstractNum w:abstractNumId="1" w15:restartNumberingAfterBreak="0">
+  <w:abstractNum w:abstractNumId="2" w15:restartNumberingAfterBreak="0">
     <w:nsid w:val="684038BD"/>
     <w:multiLevelType w:val="hybridMultilevel"/>
     <w:tmpl w:val="F4308420"/>
@@ -979,10 +1090,13 @@
     </w:lvl>
   </w:abstractNum>
   <w:num w:numId="1" w16cid:durableId="1853379454">
-    <w:abstractNumId w:val="0"/>
+    <w:abstractNumId w:val="1"/>
   </w:num>
   <w:num w:numId="2" w16cid:durableId="1828859811">
-    <w:abstractNumId w:val="1"/>
+    <w:abstractNumId w:val="2"/>
+  </w:num>
+  <w:num w:numId="3" w16cid:durableId="455638582">
+    <w:abstractNumId w:val="0"/>
   </w:num>
 </w:numbering>
 </file>
@@ -1494,6 +1608,17 @@
       <w:shd w:val="clear" w:color="auto" w:fill="E1DFDD"/>
     </w:rPr>
   </w:style>
+  <w:style w:type="paragraph" w:styleId="ListParagraph">
+    <w:name w:val="List Paragraph"/>
+    <w:basedOn w:val="Normal"/>
+    <w:uiPriority w:val="34"/>
+    <w:qFormat/>
+    <w:rsid w:val="005A6B71"/>
+    <w:pPr>
+      <w:ind w:left="720"/>
+      <w:contextualSpacing/>
+    </w:pPr>
+  </w:style>
 </w:styles>
 </file>
 

</xml_diff>